<commit_message>
Remove UKCA mention, CE only (12 languages, all formats)
Co-Authored-By: Claude Opus 5.5 <noreply@anthropic.com>
</commit_message>
<xml_diff>
--- a/ar/catalogue.docx
+++ b/ar/catalogue.docx
@@ -6,7 +6,7 @@
       <w:pPr>
         <w:pStyle w:val="note"/>
         <w:bidi/>
-        <w:divId w:val="733744263"/>
+        <w:divId w:val="530337835"/>
         <w:rPr>
           <w:rFonts w:ascii="Segoe UI" w:hAnsi="Segoe UI" w:cs="Segoe UI"/>
           <w:lang/>
@@ -545,7 +545,7 @@
       <w:pPr>
         <w:pStyle w:val="note"/>
         <w:bidi/>
-        <w:divId w:val="733744263"/>
+        <w:divId w:val="530337835"/>
         <w:rPr>
           <w:rFonts w:ascii="Segoe UI" w:hAnsi="Segoe UI" w:cs="Segoe UI"/>
           <w:rtl/>
@@ -832,7 +832,7 @@
       <w:pPr>
         <w:pStyle w:val="1"/>
         <w:bidi/>
-        <w:divId w:val="733744263"/>
+        <w:divId w:val="530337835"/>
         <w:rPr>
           <w:rFonts w:ascii="Segoe UI" w:eastAsia="Times New Roman" w:hAnsi="Segoe UI" w:cs="Segoe UI"/>
           <w:rtl/>
@@ -1004,7 +1004,7 @@
       <w:pPr>
         <w:pStyle w:val="2"/>
         <w:bidi/>
-        <w:divId w:val="733744263"/>
+        <w:divId w:val="530337835"/>
         <w:rPr>
           <w:rFonts w:ascii="Segoe UI" w:eastAsia="Times New Roman" w:hAnsi="Segoe UI" w:cs="Segoe UI"/>
           <w:rtl/>
@@ -1088,7 +1088,7 @@
       <w:pPr>
         <w:pStyle w:val="note"/>
         <w:bidi/>
-        <w:divId w:val="733744263"/>
+        <w:divId w:val="530337835"/>
         <w:rPr>
           <w:rFonts w:ascii="Segoe UI" w:hAnsi="Segoe UI" w:cs="Segoe UI"/>
           <w:rtl/>
@@ -1155,7 +1155,7 @@
       <w:pPr>
         <w:pStyle w:val="a7"/>
         <w:bidi/>
-        <w:divId w:val="733744263"/>
+        <w:divId w:val="530337835"/>
         <w:rPr>
           <w:rFonts w:ascii="Segoe UI" w:hAnsi="Segoe UI" w:cs="Segoe UI"/>
           <w:color w:val="1C1C1C"/>
@@ -1321,7 +1321,7 @@
       <w:pPr>
         <w:pStyle w:val="a7"/>
         <w:bidi/>
-        <w:divId w:val="733744263"/>
+        <w:divId w:val="530337835"/>
         <w:rPr>
           <w:rFonts w:ascii="Segoe UI" w:hAnsi="Segoe UI" w:cs="Segoe UI"/>
           <w:color w:val="1C1C1C"/>
@@ -1748,7 +1748,7 @@
       <w:pPr>
         <w:pStyle w:val="3"/>
         <w:bidi/>
-        <w:divId w:val="733744263"/>
+        <w:divId w:val="530337835"/>
         <w:rPr>
           <w:rFonts w:ascii="Segoe UI" w:eastAsia="Times New Roman" w:hAnsi="Segoe UI" w:cs="Segoe UI"/>
           <w:rtl/>
@@ -1832,7 +1832,7 @@
       <w:pPr>
         <w:pStyle w:val="a7"/>
         <w:bidi/>
-        <w:divId w:val="733744263"/>
+        <w:divId w:val="530337835"/>
         <w:rPr>
           <w:rFonts w:ascii="Segoe UI" w:hAnsi="Segoe UI" w:cs="Segoe UI"/>
           <w:color w:val="1C1C1C"/>
@@ -2466,7 +2466,7 @@
       <w:pPr>
         <w:pStyle w:val="3"/>
         <w:bidi/>
-        <w:divId w:val="733744263"/>
+        <w:divId w:val="530337835"/>
         <w:rPr>
           <w:rFonts w:ascii="Segoe UI" w:eastAsia="Times New Roman" w:hAnsi="Segoe UI" w:cs="Segoe UI"/>
           <w:rtl/>
@@ -2566,7 +2566,7 @@
       <w:pPr>
         <w:pStyle w:val="a7"/>
         <w:bidi/>
-        <w:divId w:val="733744263"/>
+        <w:divId w:val="530337835"/>
         <w:rPr>
           <w:rFonts w:ascii="Segoe UI" w:hAnsi="Segoe UI" w:cs="Segoe UI"/>
           <w:color w:val="1C1C1C"/>
@@ -3218,7 +3218,7 @@
       <w:pPr>
         <w:pStyle w:val="3"/>
         <w:bidi/>
-        <w:divId w:val="733744263"/>
+        <w:divId w:val="530337835"/>
         <w:rPr>
           <w:rFonts w:ascii="Segoe UI" w:eastAsia="Times New Roman" w:hAnsi="Segoe UI" w:cs="Segoe UI"/>
           <w:rtl/>
@@ -3286,7 +3286,7 @@
       <w:pPr>
         <w:pStyle w:val="a7"/>
         <w:bidi/>
-        <w:divId w:val="733744263"/>
+        <w:divId w:val="530337835"/>
         <w:rPr>
           <w:rFonts w:ascii="Segoe UI" w:hAnsi="Segoe UI" w:cs="Segoe UI"/>
           <w:color w:val="1C1C1C"/>
@@ -3875,7 +3875,7 @@
       <w:pPr>
         <w:pStyle w:val="note"/>
         <w:bidi/>
-        <w:divId w:val="733744263"/>
+        <w:divId w:val="530337835"/>
         <w:rPr>
           <w:rFonts w:ascii="Segoe UI" w:hAnsi="Segoe UI" w:cs="Segoe UI"/>
           <w:rtl/>
@@ -4008,7 +4008,7 @@
       <w:pPr>
         <w:pStyle w:val="3"/>
         <w:bidi/>
-        <w:divId w:val="733744263"/>
+        <w:divId w:val="530337835"/>
         <w:rPr>
           <w:rFonts w:ascii="Segoe UI" w:eastAsia="Times New Roman" w:hAnsi="Segoe UI" w:cs="Segoe UI"/>
           <w:rtl/>
@@ -4092,7 +4092,7 @@
       <w:pPr>
         <w:pStyle w:val="a7"/>
         <w:bidi/>
-        <w:divId w:val="733744263"/>
+        <w:divId w:val="530337835"/>
         <w:rPr>
           <w:rFonts w:ascii="Segoe UI" w:hAnsi="Segoe UI" w:cs="Segoe UI"/>
           <w:color w:val="1C1C1C"/>
@@ -5059,7 +5059,7 @@
       <w:pPr>
         <w:pStyle w:val="3"/>
         <w:bidi/>
-        <w:divId w:val="733744263"/>
+        <w:divId w:val="530337835"/>
         <w:rPr>
           <w:rFonts w:ascii="Segoe UI" w:eastAsia="Times New Roman" w:hAnsi="Segoe UI" w:cs="Segoe UI"/>
           <w:rtl/>
@@ -5127,7 +5127,7 @@
       <w:pPr>
         <w:pStyle w:val="a7"/>
         <w:bidi/>
-        <w:divId w:val="733744263"/>
+        <w:divId w:val="530337835"/>
         <w:rPr>
           <w:rFonts w:ascii="Segoe UI" w:hAnsi="Segoe UI" w:cs="Segoe UI"/>
           <w:color w:val="1C1C1C"/>
@@ -5878,7 +5878,7 @@
       <w:pPr>
         <w:pStyle w:val="3"/>
         <w:bidi/>
-        <w:divId w:val="733744263"/>
+        <w:divId w:val="530337835"/>
         <w:rPr>
           <w:rFonts w:ascii="Segoe UI" w:eastAsia="Times New Roman" w:hAnsi="Segoe UI" w:cs="Segoe UI"/>
           <w:rtl/>
@@ -5930,7 +5930,7 @@
       <w:pPr>
         <w:pStyle w:val="a7"/>
         <w:bidi/>
-        <w:divId w:val="733744263"/>
+        <w:divId w:val="530337835"/>
         <w:rPr>
           <w:rFonts w:ascii="Segoe UI" w:hAnsi="Segoe UI" w:cs="Segoe UI"/>
           <w:color w:val="1C1C1C"/>
@@ -6852,7 +6852,7 @@
       <w:pPr>
         <w:pStyle w:val="3"/>
         <w:bidi/>
-        <w:divId w:val="733744263"/>
+        <w:divId w:val="530337835"/>
         <w:rPr>
           <w:rFonts w:ascii="Segoe UI" w:eastAsia="Times New Roman" w:hAnsi="Segoe UI" w:cs="Segoe UI"/>
           <w:rtl/>
@@ -6968,7 +6968,7 @@
       <w:pPr>
         <w:pStyle w:val="a7"/>
         <w:bidi/>
-        <w:divId w:val="733744263"/>
+        <w:divId w:val="530337835"/>
         <w:rPr>
           <w:rFonts w:ascii="Segoe UI" w:hAnsi="Segoe UI" w:cs="Segoe UI"/>
           <w:color w:val="1C1C1C"/>
@@ -7179,7 +7179,7 @@
       <w:pPr>
         <w:pStyle w:val="a7"/>
         <w:bidi/>
-        <w:divId w:val="733744263"/>
+        <w:divId w:val="530337835"/>
         <w:rPr>
           <w:rFonts w:ascii="Segoe UI" w:hAnsi="Segoe UI" w:cs="Segoe UI"/>
           <w:color w:val="1C1C1C"/>
@@ -7453,7 +7453,7 @@
       <w:pPr>
         <w:pStyle w:val="a7"/>
         <w:bidi/>
-        <w:divId w:val="733744263"/>
+        <w:divId w:val="530337835"/>
         <w:rPr>
           <w:rFonts w:ascii="Segoe UI" w:hAnsi="Segoe UI" w:cs="Segoe UI"/>
           <w:color w:val="1C1C1C"/>
@@ -7592,7 +7592,7 @@
       <w:pPr>
         <w:pStyle w:val="3"/>
         <w:bidi/>
-        <w:divId w:val="733744263"/>
+        <w:divId w:val="530337835"/>
         <w:rPr>
           <w:rFonts w:ascii="Segoe UI" w:eastAsia="Times New Roman" w:hAnsi="Segoe UI" w:cs="Segoe UI"/>
           <w:rtl/>
@@ -7628,7 +7628,7 @@
       <w:pPr>
         <w:pStyle w:val="a7"/>
         <w:bidi/>
-        <w:divId w:val="733744263"/>
+        <w:divId w:val="530337835"/>
         <w:rPr>
           <w:rFonts w:ascii="Segoe UI" w:hAnsi="Segoe UI" w:cs="Segoe UI"/>
           <w:color w:val="1C1C1C"/>
@@ -7965,7 +7965,7 @@
       <w:pPr>
         <w:pStyle w:val="a7"/>
         <w:bidi/>
-        <w:divId w:val="733744263"/>
+        <w:divId w:val="530337835"/>
         <w:rPr>
           <w:rFonts w:ascii="Segoe UI" w:hAnsi="Segoe UI" w:cs="Segoe UI"/>
           <w:color w:val="1C1C1C"/>
@@ -8106,41 +8106,23 @@
           <w:rtl/>
           <w:lang/>
         </w:rPr>
-        <w:t>شهادتا</w:t>
-      </w:r>
-      <w:r>
-        <w:rPr>
-          <w:rFonts w:ascii="Segoe UI" w:hAnsi="Segoe UI" w:cs="Segoe UI" w:hint="cs"/>
-          <w:color w:val="1C1C1C"/>
-          <w:rtl/>
-          <w:lang/>
-        </w:rPr>
-        <w:t xml:space="preserve"> CE </w:t>
-      </w:r>
-      <w:r>
-        <w:rPr>
-          <w:rFonts w:ascii="Tahoma" w:hAnsi="Tahoma" w:cs="Tahoma" w:hint="cs"/>
-          <w:color w:val="1C1C1C"/>
-          <w:rtl/>
-          <w:lang/>
-        </w:rPr>
-        <w:t>و</w:t>
-      </w:r>
-      <w:r>
-        <w:rPr>
-          <w:rFonts w:ascii="Segoe UI" w:hAnsi="Segoe UI" w:cs="Segoe UI" w:hint="cs"/>
-          <w:color w:val="1C1C1C"/>
-          <w:rtl/>
-          <w:lang/>
-        </w:rPr>
-        <w:t>UKCA.</w:t>
+        <w:t>شهادة</w:t>
+      </w:r>
+      <w:r>
+        <w:rPr>
+          <w:rFonts w:ascii="Segoe UI" w:hAnsi="Segoe UI" w:cs="Segoe UI" w:hint="cs"/>
+          <w:color w:val="1C1C1C"/>
+          <w:rtl/>
+          <w:lang/>
+        </w:rPr>
+        <w:t xml:space="preserve"> CE.</w:t>
       </w:r>
     </w:p>
     <w:p>
       <w:pPr>
         <w:pStyle w:val="note"/>
         <w:bidi/>
-        <w:divId w:val="733744263"/>
+        <w:divId w:val="530337835"/>
         <w:rPr>
           <w:rFonts w:ascii="Segoe UI" w:hAnsi="Segoe UI" w:cs="Segoe UI"/>
           <w:rtl/>
@@ -8218,7 +8200,7 @@
       <w:pPr>
         <w:pStyle w:val="a7"/>
         <w:bidi/>
-        <w:divId w:val="733744263"/>
+        <w:divId w:val="530337835"/>
         <w:rPr>
           <w:rFonts w:ascii="Segoe UI" w:hAnsi="Segoe UI" w:cs="Segoe UI"/>
           <w:color w:val="1C1C1C"/>
@@ -8341,7 +8323,16 @@
           <w:rtl/>
           <w:lang/>
         </w:rPr>
-        <w:t>مباشرة</w:t>
+        <w:t>مب</w:t>
+      </w:r>
+      <w:r>
+        <w:rPr>
+          <w:rFonts w:ascii="Tahoma" w:hAnsi="Tahoma" w:cs="Tahoma" w:hint="cs"/>
+          <w:color w:val="1C1C1C"/>
+          <w:rtl/>
+          <w:lang/>
+        </w:rPr>
+        <w:t>اشرة</w:t>
       </w:r>
       <w:r>
         <w:rPr>
@@ -8519,7 +8510,7 @@
       <w:pPr>
         <w:pStyle w:val="a7"/>
         <w:bidi/>
-        <w:divId w:val="733744263"/>
+        <w:divId w:val="530337835"/>
         <w:rPr>
           <w:rFonts w:ascii="Segoe UI" w:hAnsi="Segoe UI" w:cs="Segoe UI"/>
           <w:color w:val="1C1C1C"/>
@@ -8541,7 +8532,7 @@
       <w:pPr>
         <w:pStyle w:val="note"/>
         <w:bidi/>
-        <w:divId w:val="733744263"/>
+        <w:divId w:val="530337835"/>
         <w:rPr>
           <w:rFonts w:ascii="Segoe UI" w:hAnsi="Segoe UI" w:cs="Segoe UI"/>
           <w:rtl/>
@@ -8564,7 +8555,7 @@
       <w:pPr>
         <w:pStyle w:val="note"/>
         <w:bidi/>
-        <w:divId w:val="733744263"/>
+        <w:divId w:val="530337835"/>
         <w:rPr>
           <w:rFonts w:ascii="Segoe UI" w:hAnsi="Segoe UI" w:cs="Segoe UI"/>
           <w:rtl/>
@@ -8664,7 +8655,7 @@
       <w:pPr>
         <w:pStyle w:val="a7"/>
         <w:bidi/>
-        <w:divId w:val="733744263"/>
+        <w:divId w:val="530337835"/>
         <w:rPr>
           <w:rFonts w:ascii="Segoe UI" w:hAnsi="Segoe UI" w:cs="Segoe UI"/>
           <w:color w:val="1C1C1C"/>
@@ -8953,7 +8944,7 @@
       </w:r>
       <w:r>
         <w:rPr>
-          <w:rFonts w:ascii="Segoe UI" w:hAnsi="Segoe UI" w:cs="Segoe UI"/>
+          <w:rFonts w:ascii="Segoe UI" w:hAnsi="Segoe UI" w:cs="Segoe UI" w:hint="cs"/>
           <w:color w:val="1C1C1C"/>
           <w:rtl/>
           <w:lang/>
@@ -9109,7 +9100,7 @@
       <w:pPr>
         <w:pStyle w:val="a7"/>
         <w:bidi/>
-        <w:divId w:val="733744263"/>
+        <w:divId w:val="530337835"/>
         <w:rPr>
           <w:rFonts w:ascii="Segoe UI" w:hAnsi="Segoe UI" w:cs="Segoe UI"/>
           <w:color w:val="1C1C1C"/>
@@ -9556,6 +9547,24 @@
           <w:rtl/>
           <w:lang/>
         </w:rPr>
+        <w:t>الخطوة</w:t>
+      </w:r>
+      <w:r>
+        <w:rPr>
+          <w:rFonts w:ascii="Segoe UI" w:hAnsi="Segoe UI" w:cs="Segoe UI" w:hint="cs"/>
+          <w:color w:val="1C1C1C"/>
+          <w:rtl/>
+          <w:lang/>
+        </w:rPr>
+        <w:t xml:space="preserve"> </w:t>
+      </w:r>
+      <w:r>
+        <w:rPr>
+          <w:rFonts w:ascii="Tahoma" w:hAnsi="Tahoma" w:cs="Tahoma" w:hint="cs"/>
+          <w:color w:val="1C1C1C"/>
+          <w:rtl/>
+          <w:lang/>
+        </w:rPr>
         <w:t>ال</w:t>
       </w:r>
       <w:r>
@@ -9565,25 +9574,7 @@
           <w:rtl/>
           <w:lang/>
         </w:rPr>
-        <w:t>خطوة</w:t>
-      </w:r>
-      <w:r>
-        <w:rPr>
-          <w:rFonts w:ascii="Segoe UI" w:hAnsi="Segoe UI" w:cs="Segoe UI" w:hint="cs"/>
-          <w:color w:val="1C1C1C"/>
-          <w:rtl/>
-          <w:lang/>
-        </w:rPr>
-        <w:t xml:space="preserve"> </w:t>
-      </w:r>
-      <w:r>
-        <w:rPr>
-          <w:rFonts w:ascii="Tahoma" w:hAnsi="Tahoma" w:cs="Tahoma" w:hint="cs"/>
-          <w:color w:val="1C1C1C"/>
-          <w:rtl/>
-          <w:lang/>
-        </w:rPr>
-        <w:t>الافتراضية</w:t>
+        <w:t>افتراضية</w:t>
       </w:r>
       <w:r>
         <w:rPr>
@@ -10015,41 +10006,23 @@
           <w:rtl/>
           <w:lang/>
         </w:rPr>
-        <w:t>شهادتا</w:t>
-      </w:r>
-      <w:r>
-        <w:rPr>
-          <w:rFonts w:ascii="Segoe UI" w:hAnsi="Segoe UI" w:cs="Segoe UI" w:hint="cs"/>
-          <w:color w:val="1C1C1C"/>
-          <w:rtl/>
-          <w:lang/>
-        </w:rPr>
-        <w:t xml:space="preserve"> CE </w:t>
-      </w:r>
-      <w:r>
-        <w:rPr>
-          <w:rFonts w:ascii="Tahoma" w:hAnsi="Tahoma" w:cs="Tahoma" w:hint="cs"/>
-          <w:color w:val="1C1C1C"/>
-          <w:rtl/>
-          <w:lang/>
-        </w:rPr>
-        <w:t>و</w:t>
-      </w:r>
-      <w:r>
-        <w:rPr>
-          <w:rFonts w:ascii="Segoe UI" w:hAnsi="Segoe UI" w:cs="Segoe UI" w:hint="cs"/>
-          <w:color w:val="1C1C1C"/>
-          <w:rtl/>
-          <w:lang/>
-        </w:rPr>
-        <w:t>UKCA.</w:t>
+        <w:t>شهادة</w:t>
+      </w:r>
+      <w:r>
+        <w:rPr>
+          <w:rFonts w:ascii="Segoe UI" w:hAnsi="Segoe UI" w:cs="Segoe UI" w:hint="cs"/>
+          <w:color w:val="1C1C1C"/>
+          <w:rtl/>
+          <w:lang/>
+        </w:rPr>
+        <w:t xml:space="preserve"> CE.</w:t>
       </w:r>
     </w:p>
     <w:p>
       <w:pPr>
         <w:pStyle w:val="a7"/>
         <w:bidi/>
-        <w:divId w:val="733744263"/>
+        <w:divId w:val="530337835"/>
         <w:rPr>
           <w:rFonts w:ascii="Segoe UI" w:hAnsi="Segoe UI" w:cs="Segoe UI"/>
           <w:color w:val="1C1C1C"/>
@@ -10208,16 +10181,7 @@
           <w:rtl/>
           <w:lang/>
         </w:rPr>
-        <w:t>الض</w:t>
-      </w:r>
-      <w:r>
-        <w:rPr>
-          <w:rFonts w:ascii="Tahoma" w:hAnsi="Tahoma" w:cs="Tahoma" w:hint="cs"/>
-          <w:color w:val="1C1C1C"/>
-          <w:rtl/>
-          <w:lang/>
-        </w:rPr>
-        <w:t>مان</w:t>
+        <w:t>الضمان</w:t>
       </w:r>
       <w:r>
         <w:rPr>
@@ -10253,7 +10217,16 @@
           <w:rtl/>
           <w:lang/>
         </w:rPr>
-        <w:t>يوفّرهما</w:t>
+        <w:t>يو</w:t>
+      </w:r>
+      <w:r>
+        <w:rPr>
+          <w:rFonts w:ascii="Tahoma" w:hAnsi="Tahoma" w:cs="Tahoma" w:hint="cs"/>
+          <w:color w:val="1C1C1C"/>
+          <w:rtl/>
+          <w:lang/>
+        </w:rPr>
+        <w:t>فّرهما</w:t>
       </w:r>
       <w:r>
         <w:rPr>
@@ -10287,7 +10260,7 @@
       <w:pPr>
         <w:pStyle w:val="note"/>
         <w:bidi/>
-        <w:divId w:val="733744263"/>
+        <w:divId w:val="530337835"/>
         <w:rPr>
           <w:rFonts w:ascii="Segoe UI" w:hAnsi="Segoe UI" w:cs="Segoe UI"/>
           <w:rtl/>
@@ -10409,7 +10382,7 @@
       <w:pPr>
         <w:pStyle w:val="note"/>
         <w:bidi/>
-        <w:divId w:val="733744263"/>
+        <w:divId w:val="530337835"/>
         <w:rPr>
           <w:rFonts w:ascii="Segoe UI" w:hAnsi="Segoe UI" w:cs="Segoe UI"/>
           <w:rtl/>
@@ -10736,7 +10709,7 @@
     <w:uiPriority w:val="9"/>
     <w:qFormat/>
     <w:pPr>
-      <w:spacing w:after="34"/>
+      <w:spacing w:after="48"/>
       <w:outlineLvl w:val="0"/>
     </w:pPr>
     <w:rPr>
@@ -10755,7 +10728,7 @@
     <w:uiPriority w:val="9"/>
     <w:qFormat/>
     <w:pPr>
-      <w:spacing w:after="155"/>
+      <w:spacing w:after="216"/>
       <w:outlineLvl w:val="1"/>
     </w:pPr>
     <w:rPr>
@@ -10774,9 +10747,9 @@
     <w:qFormat/>
     <w:pPr>
       <w:pBdr>
-        <w:top w:val="single" w:sz="4" w:space="6" w:color="E6E6E6"/>
+        <w:top w:val="single" w:sz="4" w:space="8" w:color="E6E6E6"/>
       </w:pBdr>
-      <w:spacing w:before="190" w:after="52"/>
+      <w:spacing w:before="264" w:after="72"/>
       <w:outlineLvl w:val="2"/>
     </w:pPr>
     <w:rPr>
@@ -10916,14 +10889,14 @@
     <w:semiHidden/>
     <w:unhideWhenUsed/>
     <w:pPr>
-      <w:spacing w:after="86"/>
+      <w:spacing w:after="120"/>
     </w:pPr>
   </w:style>
   <w:style w:type="paragraph" w:customStyle="1" w:styleId="note">
     <w:name w:val="note"/>
     <w:basedOn w:val="a"/>
     <w:pPr>
-      <w:spacing w:after="86"/>
+      <w:spacing w:after="120"/>
     </w:pPr>
     <w:rPr>
       <w:i/>
@@ -10937,7 +10910,7 @@
     <w:name w:val="url"/>
     <w:basedOn w:val="a"/>
     <w:pPr>
-      <w:spacing w:after="86"/>
+      <w:spacing w:after="120"/>
     </w:pPr>
     <w:rPr>
       <w:b/>

</xml_diff>

<commit_message>
Add Polish catalogue; Designed in France instead of Made in Cannes (all languages)
Co-Authored-By: Claude Opus 5.5 <noreply@anthropic.com>
</commit_message>
<xml_diff>
--- a/ar/catalogue.docx
+++ b/ar/catalogue.docx
@@ -6,7 +6,7 @@
       <w:pPr>
         <w:pStyle w:val="note"/>
         <w:bidi/>
-        <w:divId w:val="530337835"/>
+        <w:divId w:val="685323372"/>
         <w:rPr>
           <w:rFonts w:ascii="Segoe UI" w:hAnsi="Segoe UI" w:cs="Segoe UI"/>
           <w:lang/>
@@ -545,7 +545,7 @@
       <w:pPr>
         <w:pStyle w:val="note"/>
         <w:bidi/>
-        <w:divId w:val="530337835"/>
+        <w:divId w:val="685323372"/>
         <w:rPr>
           <w:rFonts w:ascii="Segoe UI" w:hAnsi="Segoe UI" w:cs="Segoe UI"/>
           <w:rtl/>
@@ -832,7 +832,7 @@
       <w:pPr>
         <w:pStyle w:val="1"/>
         <w:bidi/>
-        <w:divId w:val="530337835"/>
+        <w:divId w:val="685323372"/>
         <w:rPr>
           <w:rFonts w:ascii="Segoe UI" w:eastAsia="Times New Roman" w:hAnsi="Segoe UI" w:cs="Segoe UI"/>
           <w:rtl/>
@@ -1004,7 +1004,7 @@
       <w:pPr>
         <w:pStyle w:val="2"/>
         <w:bidi/>
-        <w:divId w:val="530337835"/>
+        <w:divId w:val="685323372"/>
         <w:rPr>
           <w:rFonts w:ascii="Segoe UI" w:eastAsia="Times New Roman" w:hAnsi="Segoe UI" w:cs="Segoe UI"/>
           <w:rtl/>
@@ -1088,7 +1088,7 @@
       <w:pPr>
         <w:pStyle w:val="note"/>
         <w:bidi/>
-        <w:divId w:val="530337835"/>
+        <w:divId w:val="685323372"/>
         <w:rPr>
           <w:rFonts w:ascii="Segoe UI" w:hAnsi="Segoe UI" w:cs="Segoe UI"/>
           <w:rtl/>
@@ -1155,7 +1155,7 @@
       <w:pPr>
         <w:pStyle w:val="a7"/>
         <w:bidi/>
-        <w:divId w:val="530337835"/>
+        <w:divId w:val="685323372"/>
         <w:rPr>
           <w:rFonts w:ascii="Segoe UI" w:hAnsi="Segoe UI" w:cs="Segoe UI"/>
           <w:color w:val="1C1C1C"/>
@@ -1321,7 +1321,7 @@
       <w:pPr>
         <w:pStyle w:val="a7"/>
         <w:bidi/>
-        <w:divId w:val="530337835"/>
+        <w:divId w:val="685323372"/>
         <w:rPr>
           <w:rFonts w:ascii="Segoe UI" w:hAnsi="Segoe UI" w:cs="Segoe UI"/>
           <w:color w:val="1C1C1C"/>
@@ -1748,7 +1748,7 @@
       <w:pPr>
         <w:pStyle w:val="3"/>
         <w:bidi/>
-        <w:divId w:val="530337835"/>
+        <w:divId w:val="685323372"/>
         <w:rPr>
           <w:rFonts w:ascii="Segoe UI" w:eastAsia="Times New Roman" w:hAnsi="Segoe UI" w:cs="Segoe UI"/>
           <w:rtl/>
@@ -1832,7 +1832,7 @@
       <w:pPr>
         <w:pStyle w:val="a7"/>
         <w:bidi/>
-        <w:divId w:val="530337835"/>
+        <w:divId w:val="685323372"/>
         <w:rPr>
           <w:rFonts w:ascii="Segoe UI" w:hAnsi="Segoe UI" w:cs="Segoe UI"/>
           <w:color w:val="1C1C1C"/>
@@ -2466,7 +2466,7 @@
       <w:pPr>
         <w:pStyle w:val="3"/>
         <w:bidi/>
-        <w:divId w:val="530337835"/>
+        <w:divId w:val="685323372"/>
         <w:rPr>
           <w:rFonts w:ascii="Segoe UI" w:eastAsia="Times New Roman" w:hAnsi="Segoe UI" w:cs="Segoe UI"/>
           <w:rtl/>
@@ -2566,7 +2566,7 @@
       <w:pPr>
         <w:pStyle w:val="a7"/>
         <w:bidi/>
-        <w:divId w:val="530337835"/>
+        <w:divId w:val="685323372"/>
         <w:rPr>
           <w:rFonts w:ascii="Segoe UI" w:hAnsi="Segoe UI" w:cs="Segoe UI"/>
           <w:color w:val="1C1C1C"/>
@@ -3218,7 +3218,7 @@
       <w:pPr>
         <w:pStyle w:val="3"/>
         <w:bidi/>
-        <w:divId w:val="530337835"/>
+        <w:divId w:val="685323372"/>
         <w:rPr>
           <w:rFonts w:ascii="Segoe UI" w:eastAsia="Times New Roman" w:hAnsi="Segoe UI" w:cs="Segoe UI"/>
           <w:rtl/>
@@ -3286,7 +3286,7 @@
       <w:pPr>
         <w:pStyle w:val="a7"/>
         <w:bidi/>
-        <w:divId w:val="530337835"/>
+        <w:divId w:val="685323372"/>
         <w:rPr>
           <w:rFonts w:ascii="Segoe UI" w:hAnsi="Segoe UI" w:cs="Segoe UI"/>
           <w:color w:val="1C1C1C"/>
@@ -3875,7 +3875,7 @@
       <w:pPr>
         <w:pStyle w:val="note"/>
         <w:bidi/>
-        <w:divId w:val="530337835"/>
+        <w:divId w:val="685323372"/>
         <w:rPr>
           <w:rFonts w:ascii="Segoe UI" w:hAnsi="Segoe UI" w:cs="Segoe UI"/>
           <w:rtl/>
@@ -4008,7 +4008,7 @@
       <w:pPr>
         <w:pStyle w:val="3"/>
         <w:bidi/>
-        <w:divId w:val="530337835"/>
+        <w:divId w:val="685323372"/>
         <w:rPr>
           <w:rFonts w:ascii="Segoe UI" w:eastAsia="Times New Roman" w:hAnsi="Segoe UI" w:cs="Segoe UI"/>
           <w:rtl/>
@@ -4092,7 +4092,7 @@
       <w:pPr>
         <w:pStyle w:val="a7"/>
         <w:bidi/>
-        <w:divId w:val="530337835"/>
+        <w:divId w:val="685323372"/>
         <w:rPr>
           <w:rFonts w:ascii="Segoe UI" w:hAnsi="Segoe UI" w:cs="Segoe UI"/>
           <w:color w:val="1C1C1C"/>
@@ -5059,7 +5059,7 @@
       <w:pPr>
         <w:pStyle w:val="3"/>
         <w:bidi/>
-        <w:divId w:val="530337835"/>
+        <w:divId w:val="685323372"/>
         <w:rPr>
           <w:rFonts w:ascii="Segoe UI" w:eastAsia="Times New Roman" w:hAnsi="Segoe UI" w:cs="Segoe UI"/>
           <w:rtl/>
@@ -5127,7 +5127,7 @@
       <w:pPr>
         <w:pStyle w:val="a7"/>
         <w:bidi/>
-        <w:divId w:val="530337835"/>
+        <w:divId w:val="685323372"/>
         <w:rPr>
           <w:rFonts w:ascii="Segoe UI" w:hAnsi="Segoe UI" w:cs="Segoe UI"/>
           <w:color w:val="1C1C1C"/>
@@ -5878,7 +5878,7 @@
       <w:pPr>
         <w:pStyle w:val="3"/>
         <w:bidi/>
-        <w:divId w:val="530337835"/>
+        <w:divId w:val="685323372"/>
         <w:rPr>
           <w:rFonts w:ascii="Segoe UI" w:eastAsia="Times New Roman" w:hAnsi="Segoe UI" w:cs="Segoe UI"/>
           <w:rtl/>
@@ -5930,7 +5930,7 @@
       <w:pPr>
         <w:pStyle w:val="a7"/>
         <w:bidi/>
-        <w:divId w:val="530337835"/>
+        <w:divId w:val="685323372"/>
         <w:rPr>
           <w:rFonts w:ascii="Segoe UI" w:hAnsi="Segoe UI" w:cs="Segoe UI"/>
           <w:color w:val="1C1C1C"/>
@@ -6852,7 +6852,7 @@
       <w:pPr>
         <w:pStyle w:val="3"/>
         <w:bidi/>
-        <w:divId w:val="530337835"/>
+        <w:divId w:val="685323372"/>
         <w:rPr>
           <w:rFonts w:ascii="Segoe UI" w:eastAsia="Times New Roman" w:hAnsi="Segoe UI" w:cs="Segoe UI"/>
           <w:rtl/>
@@ -6968,7 +6968,7 @@
       <w:pPr>
         <w:pStyle w:val="a7"/>
         <w:bidi/>
-        <w:divId w:val="530337835"/>
+        <w:divId w:val="685323372"/>
         <w:rPr>
           <w:rFonts w:ascii="Segoe UI" w:hAnsi="Segoe UI" w:cs="Segoe UI"/>
           <w:color w:val="1C1C1C"/>
@@ -7179,7 +7179,7 @@
       <w:pPr>
         <w:pStyle w:val="a7"/>
         <w:bidi/>
-        <w:divId w:val="530337835"/>
+        <w:divId w:val="685323372"/>
         <w:rPr>
           <w:rFonts w:ascii="Segoe UI" w:hAnsi="Segoe UI" w:cs="Segoe UI"/>
           <w:color w:val="1C1C1C"/>
@@ -7453,7 +7453,7 @@
       <w:pPr>
         <w:pStyle w:val="a7"/>
         <w:bidi/>
-        <w:divId w:val="530337835"/>
+        <w:divId w:val="685323372"/>
         <w:rPr>
           <w:rFonts w:ascii="Segoe UI" w:hAnsi="Segoe UI" w:cs="Segoe UI"/>
           <w:color w:val="1C1C1C"/>
@@ -7592,7 +7592,7 @@
       <w:pPr>
         <w:pStyle w:val="3"/>
         <w:bidi/>
-        <w:divId w:val="530337835"/>
+        <w:divId w:val="685323372"/>
         <w:rPr>
           <w:rFonts w:ascii="Segoe UI" w:eastAsia="Times New Roman" w:hAnsi="Segoe UI" w:cs="Segoe UI"/>
           <w:rtl/>
@@ -7628,7 +7628,7 @@
       <w:pPr>
         <w:pStyle w:val="a7"/>
         <w:bidi/>
-        <w:divId w:val="530337835"/>
+        <w:divId w:val="685323372"/>
         <w:rPr>
           <w:rFonts w:ascii="Segoe UI" w:hAnsi="Segoe UI" w:cs="Segoe UI"/>
           <w:color w:val="1C1C1C"/>
@@ -7965,7 +7965,7 @@
       <w:pPr>
         <w:pStyle w:val="a7"/>
         <w:bidi/>
-        <w:divId w:val="530337835"/>
+        <w:divId w:val="685323372"/>
         <w:rPr>
           <w:rFonts w:ascii="Segoe UI" w:hAnsi="Segoe UI" w:cs="Segoe UI"/>
           <w:color w:val="1C1C1C"/>
@@ -8016,7 +8016,7 @@
           <w:rtl/>
           <w:lang/>
         </w:rPr>
-        <w:t>صُنع</w:t>
+        <w:t>صُمّم</w:t>
       </w:r>
       <w:r>
         <w:rPr>
@@ -8052,43 +8052,7 @@
           <w:rtl/>
           <w:lang/>
         </w:rPr>
-        <w:t>فرنسا</w:t>
-      </w:r>
-      <w:r>
-        <w:rPr>
-          <w:rFonts w:ascii="Segoe UI" w:hAnsi="Segoe UI" w:cs="Segoe UI" w:hint="cs"/>
-          <w:color w:val="1C1C1C"/>
-          <w:rtl/>
-          <w:lang/>
-        </w:rPr>
-        <w:t xml:space="preserve"> (</w:t>
-      </w:r>
-      <w:r>
-        <w:rPr>
-          <w:rFonts w:ascii="Tahoma" w:hAnsi="Tahoma" w:cs="Tahoma" w:hint="cs"/>
-          <w:color w:val="1C1C1C"/>
-          <w:rtl/>
-          <w:lang/>
-        </w:rPr>
-        <w:t>كان</w:t>
-      </w:r>
-      <w:r>
-        <w:rPr>
-          <w:rFonts w:ascii="Segoe UI" w:hAnsi="Segoe UI" w:cs="Segoe UI" w:hint="cs"/>
-          <w:color w:val="1C1C1C"/>
-          <w:rtl/>
-          <w:lang/>
-        </w:rPr>
-        <w:t>)</w:t>
-      </w:r>
-      <w:r>
-        <w:rPr>
-          <w:rFonts w:ascii="Tahoma" w:hAnsi="Tahoma" w:cs="Tahoma" w:hint="cs"/>
-          <w:color w:val="1C1C1C"/>
-          <w:rtl/>
-          <w:lang/>
-        </w:rPr>
-        <w:t>،</w:t>
+        <w:t>فرنسا،</w:t>
       </w:r>
       <w:r>
         <w:rPr>
@@ -8122,7 +8086,7 @@
       <w:pPr>
         <w:pStyle w:val="note"/>
         <w:bidi/>
-        <w:divId w:val="530337835"/>
+        <w:divId w:val="685323372"/>
         <w:rPr>
           <w:rFonts w:ascii="Segoe UI" w:hAnsi="Segoe UI" w:cs="Segoe UI"/>
           <w:rtl/>
@@ -8200,7 +8164,7 @@
       <w:pPr>
         <w:pStyle w:val="a7"/>
         <w:bidi/>
-        <w:divId w:val="530337835"/>
+        <w:divId w:val="685323372"/>
         <w:rPr>
           <w:rFonts w:ascii="Segoe UI" w:hAnsi="Segoe UI" w:cs="Segoe UI"/>
           <w:color w:val="1C1C1C"/>
@@ -8323,16 +8287,7 @@
           <w:rtl/>
           <w:lang/>
         </w:rPr>
-        <w:t>مب</w:t>
-      </w:r>
-      <w:r>
-        <w:rPr>
-          <w:rFonts w:ascii="Tahoma" w:hAnsi="Tahoma" w:cs="Tahoma" w:hint="cs"/>
-          <w:color w:val="1C1C1C"/>
-          <w:rtl/>
-          <w:lang/>
-        </w:rPr>
-        <w:t>اشرة</w:t>
+        <w:t>مباشرة</w:t>
       </w:r>
       <w:r>
         <w:rPr>
@@ -8510,7 +8465,7 @@
       <w:pPr>
         <w:pStyle w:val="a7"/>
         <w:bidi/>
-        <w:divId w:val="530337835"/>
+        <w:divId w:val="685323372"/>
         <w:rPr>
           <w:rFonts w:ascii="Segoe UI" w:hAnsi="Segoe UI" w:cs="Segoe UI"/>
           <w:color w:val="1C1C1C"/>
@@ -8532,7 +8487,7 @@
       <w:pPr>
         <w:pStyle w:val="note"/>
         <w:bidi/>
-        <w:divId w:val="530337835"/>
+        <w:divId w:val="685323372"/>
         <w:rPr>
           <w:rFonts w:ascii="Segoe UI" w:hAnsi="Segoe UI" w:cs="Segoe UI"/>
           <w:rtl/>
@@ -8555,7 +8510,7 @@
       <w:pPr>
         <w:pStyle w:val="note"/>
         <w:bidi/>
-        <w:divId w:val="530337835"/>
+        <w:divId w:val="685323372"/>
         <w:rPr>
           <w:rFonts w:ascii="Segoe UI" w:hAnsi="Segoe UI" w:cs="Segoe UI"/>
           <w:rtl/>
@@ -8655,7 +8610,7 @@
       <w:pPr>
         <w:pStyle w:val="a7"/>
         <w:bidi/>
-        <w:divId w:val="530337835"/>
+        <w:divId w:val="685323372"/>
         <w:rPr>
           <w:rFonts w:ascii="Segoe UI" w:hAnsi="Segoe UI" w:cs="Segoe UI"/>
           <w:color w:val="1C1C1C"/>
@@ -8958,7 +8913,16 @@
           <w:rtl/>
           <w:lang/>
         </w:rPr>
-        <w:t>والشاحن</w:t>
+        <w:t>والشا</w:t>
+      </w:r>
+      <w:r>
+        <w:rPr>
+          <w:rFonts w:ascii="Tahoma" w:hAnsi="Tahoma" w:cs="Tahoma" w:hint="cs"/>
+          <w:color w:val="1C1C1C"/>
+          <w:rtl/>
+          <w:lang/>
+        </w:rPr>
+        <w:t>حن</w:t>
       </w:r>
       <w:r>
         <w:rPr>
@@ -9100,7 +9064,7 @@
       <w:pPr>
         <w:pStyle w:val="a7"/>
         <w:bidi/>
-        <w:divId w:val="530337835"/>
+        <w:divId w:val="685323372"/>
         <w:rPr>
           <w:rFonts w:ascii="Segoe UI" w:hAnsi="Segoe UI" w:cs="Segoe UI"/>
           <w:color w:val="1C1C1C"/>
@@ -9565,16 +9529,16 @@
           <w:rtl/>
           <w:lang/>
         </w:rPr>
-        <w:t>ال</w:t>
-      </w:r>
-      <w:r>
-        <w:rPr>
-          <w:rFonts w:ascii="Tahoma" w:hAnsi="Tahoma" w:cs="Tahoma" w:hint="cs"/>
-          <w:color w:val="1C1C1C"/>
-          <w:rtl/>
-          <w:lang/>
-        </w:rPr>
-        <w:t>افتراضية</w:t>
+        <w:t>الافترا</w:t>
+      </w:r>
+      <w:r>
+        <w:rPr>
+          <w:rFonts w:ascii="Tahoma" w:hAnsi="Tahoma" w:cs="Tahoma" w:hint="cs"/>
+          <w:color w:val="1C1C1C"/>
+          <w:rtl/>
+          <w:lang/>
+        </w:rPr>
+        <w:t>ضية</w:t>
       </w:r>
       <w:r>
         <w:rPr>
@@ -9934,7 +9898,7 @@
           <w:rtl/>
           <w:lang/>
         </w:rPr>
-        <w:t>صُنع</w:t>
+        <w:t>صُمّم</w:t>
       </w:r>
       <w:r>
         <w:rPr>
@@ -9953,24 +9917,6 @@
           <w:lang/>
         </w:rPr>
         <w:t>في</w:t>
-      </w:r>
-      <w:r>
-        <w:rPr>
-          <w:rFonts w:ascii="Segoe UI" w:hAnsi="Segoe UI" w:cs="Segoe UI" w:hint="cs"/>
-          <w:color w:val="1C1C1C"/>
-          <w:rtl/>
-          <w:lang/>
-        </w:rPr>
-        <w:t xml:space="preserve"> </w:t>
-      </w:r>
-      <w:r>
-        <w:rPr>
-          <w:rFonts w:ascii="Tahoma" w:hAnsi="Tahoma" w:cs="Tahoma" w:hint="cs"/>
-          <w:color w:val="1C1C1C"/>
-          <w:rtl/>
-          <w:lang/>
-        </w:rPr>
-        <w:t>كان،</w:t>
       </w:r>
       <w:r>
         <w:rPr>
@@ -10022,7 +9968,7 @@
       <w:pPr>
         <w:pStyle w:val="a7"/>
         <w:bidi/>
-        <w:divId w:val="530337835"/>
+        <w:divId w:val="685323372"/>
         <w:rPr>
           <w:rFonts w:ascii="Segoe UI" w:hAnsi="Segoe UI" w:cs="Segoe UI"/>
           <w:color w:val="1C1C1C"/>
@@ -10217,34 +10163,34 @@
           <w:rtl/>
           <w:lang/>
         </w:rPr>
-        <w:t>يو</w:t>
-      </w:r>
-      <w:r>
-        <w:rPr>
-          <w:rFonts w:ascii="Tahoma" w:hAnsi="Tahoma" w:cs="Tahoma" w:hint="cs"/>
-          <w:color w:val="1C1C1C"/>
-          <w:rtl/>
-          <w:lang/>
-        </w:rPr>
-        <w:t>فّرهما</w:t>
-      </w:r>
-      <w:r>
-        <w:rPr>
-          <w:rFonts w:ascii="Segoe UI" w:hAnsi="Segoe UI" w:cs="Segoe UI" w:hint="cs"/>
-          <w:color w:val="1C1C1C"/>
-          <w:rtl/>
-          <w:lang/>
-        </w:rPr>
-        <w:t xml:space="preserve"> </w:t>
-      </w:r>
-      <w:r>
-        <w:rPr>
-          <w:rFonts w:ascii="Tahoma" w:hAnsi="Tahoma" w:cs="Tahoma" w:hint="cs"/>
-          <w:color w:val="1C1C1C"/>
-          <w:rtl/>
-          <w:lang/>
-        </w:rPr>
-        <w:t>الموزّع</w:t>
+        <w:t>يوفّرهما</w:t>
+      </w:r>
+      <w:r>
+        <w:rPr>
+          <w:rFonts w:ascii="Segoe UI" w:hAnsi="Segoe UI" w:cs="Segoe UI" w:hint="cs"/>
+          <w:color w:val="1C1C1C"/>
+          <w:rtl/>
+          <w:lang/>
+        </w:rPr>
+        <w:t xml:space="preserve"> </w:t>
+      </w:r>
+      <w:r>
+        <w:rPr>
+          <w:rFonts w:ascii="Tahoma" w:hAnsi="Tahoma" w:cs="Tahoma" w:hint="cs"/>
+          <w:color w:val="1C1C1C"/>
+          <w:rtl/>
+          <w:lang/>
+        </w:rPr>
+        <w:t>ال</w:t>
+      </w:r>
+      <w:r>
+        <w:rPr>
+          <w:rFonts w:ascii="Tahoma" w:hAnsi="Tahoma" w:cs="Tahoma" w:hint="cs"/>
+          <w:color w:val="1C1C1C"/>
+          <w:rtl/>
+          <w:lang/>
+        </w:rPr>
+        <w:t>موزّع</w:t>
       </w:r>
       <w:r>
         <w:rPr>
@@ -10260,7 +10206,7 @@
       <w:pPr>
         <w:pStyle w:val="note"/>
         <w:bidi/>
-        <w:divId w:val="530337835"/>
+        <w:divId w:val="685323372"/>
         <w:rPr>
           <w:rFonts w:ascii="Segoe UI" w:hAnsi="Segoe UI" w:cs="Segoe UI"/>
           <w:rtl/>
@@ -10382,7 +10328,7 @@
       <w:pPr>
         <w:pStyle w:val="note"/>
         <w:bidi/>
-        <w:divId w:val="530337835"/>
+        <w:divId w:val="685323372"/>
         <w:rPr>
           <w:rFonts w:ascii="Segoe UI" w:hAnsi="Segoe UI" w:cs="Segoe UI"/>
           <w:rtl/>

</xml_diff>

<commit_message>
Update weights: robot 225 g, panel 760 g, tiles 150 g, boxed kit about 1.9 kg (13 languages)
Co-Authored-By: Claude Opus 5.5 <noreply@anthropic.com>
</commit_message>
<xml_diff>
--- a/ar/catalogue.docx
+++ b/ar/catalogue.docx
@@ -6,7 +6,7 @@
       <w:pPr>
         <w:pStyle w:val="note"/>
         <w:bidi/>
-        <w:divId w:val="685323372"/>
+        <w:divId w:val="972368265"/>
         <w:rPr>
           <w:rFonts w:ascii="Segoe UI" w:hAnsi="Segoe UI" w:cs="Segoe UI"/>
           <w:lang/>
@@ -545,7 +545,7 @@
       <w:pPr>
         <w:pStyle w:val="note"/>
         <w:bidi/>
-        <w:divId w:val="685323372"/>
+        <w:divId w:val="972368265"/>
         <w:rPr>
           <w:rFonts w:ascii="Segoe UI" w:hAnsi="Segoe UI" w:cs="Segoe UI"/>
           <w:rtl/>
@@ -832,7 +832,7 @@
       <w:pPr>
         <w:pStyle w:val="1"/>
         <w:bidi/>
-        <w:divId w:val="685323372"/>
+        <w:divId w:val="972368265"/>
         <w:rPr>
           <w:rFonts w:ascii="Segoe UI" w:eastAsia="Times New Roman" w:hAnsi="Segoe UI" w:cs="Segoe UI"/>
           <w:rtl/>
@@ -1004,7 +1004,7 @@
       <w:pPr>
         <w:pStyle w:val="2"/>
         <w:bidi/>
-        <w:divId w:val="685323372"/>
+        <w:divId w:val="972368265"/>
         <w:rPr>
           <w:rFonts w:ascii="Segoe UI" w:eastAsia="Times New Roman" w:hAnsi="Segoe UI" w:cs="Segoe UI"/>
           <w:rtl/>
@@ -1088,7 +1088,7 @@
       <w:pPr>
         <w:pStyle w:val="note"/>
         <w:bidi/>
-        <w:divId w:val="685323372"/>
+        <w:divId w:val="972368265"/>
         <w:rPr>
           <w:rFonts w:ascii="Segoe UI" w:hAnsi="Segoe UI" w:cs="Segoe UI"/>
           <w:rtl/>
@@ -1155,7 +1155,7 @@
       <w:pPr>
         <w:pStyle w:val="a7"/>
         <w:bidi/>
-        <w:divId w:val="685323372"/>
+        <w:divId w:val="972368265"/>
         <w:rPr>
           <w:rFonts w:ascii="Segoe UI" w:hAnsi="Segoe UI" w:cs="Segoe UI"/>
           <w:color w:val="1C1C1C"/>
@@ -1321,7 +1321,7 @@
       <w:pPr>
         <w:pStyle w:val="a7"/>
         <w:bidi/>
-        <w:divId w:val="685323372"/>
+        <w:divId w:val="972368265"/>
         <w:rPr>
           <w:rFonts w:ascii="Segoe UI" w:hAnsi="Segoe UI" w:cs="Segoe UI"/>
           <w:color w:val="1C1C1C"/>
@@ -1748,7 +1748,7 @@
       <w:pPr>
         <w:pStyle w:val="3"/>
         <w:bidi/>
-        <w:divId w:val="685323372"/>
+        <w:divId w:val="972368265"/>
         <w:rPr>
           <w:rFonts w:ascii="Segoe UI" w:eastAsia="Times New Roman" w:hAnsi="Segoe UI" w:cs="Segoe UI"/>
           <w:rtl/>
@@ -1832,7 +1832,7 @@
       <w:pPr>
         <w:pStyle w:val="a7"/>
         <w:bidi/>
-        <w:divId w:val="685323372"/>
+        <w:divId w:val="972368265"/>
         <w:rPr>
           <w:rFonts w:ascii="Segoe UI" w:hAnsi="Segoe UI" w:cs="Segoe UI"/>
           <w:color w:val="1C1C1C"/>
@@ -2466,7 +2466,7 @@
       <w:pPr>
         <w:pStyle w:val="3"/>
         <w:bidi/>
-        <w:divId w:val="685323372"/>
+        <w:divId w:val="972368265"/>
         <w:rPr>
           <w:rFonts w:ascii="Segoe UI" w:eastAsia="Times New Roman" w:hAnsi="Segoe UI" w:cs="Segoe UI"/>
           <w:rtl/>
@@ -2566,7 +2566,7 @@
       <w:pPr>
         <w:pStyle w:val="a7"/>
         <w:bidi/>
-        <w:divId w:val="685323372"/>
+        <w:divId w:val="972368265"/>
         <w:rPr>
           <w:rFonts w:ascii="Segoe UI" w:hAnsi="Segoe UI" w:cs="Segoe UI"/>
           <w:color w:val="1C1C1C"/>
@@ -3218,7 +3218,7 @@
       <w:pPr>
         <w:pStyle w:val="3"/>
         <w:bidi/>
-        <w:divId w:val="685323372"/>
+        <w:divId w:val="972368265"/>
         <w:rPr>
           <w:rFonts w:ascii="Segoe UI" w:eastAsia="Times New Roman" w:hAnsi="Segoe UI" w:cs="Segoe UI"/>
           <w:rtl/>
@@ -3286,7 +3286,7 @@
       <w:pPr>
         <w:pStyle w:val="a7"/>
         <w:bidi/>
-        <w:divId w:val="685323372"/>
+        <w:divId w:val="972368265"/>
         <w:rPr>
           <w:rFonts w:ascii="Segoe UI" w:hAnsi="Segoe UI" w:cs="Segoe UI"/>
           <w:color w:val="1C1C1C"/>
@@ -3875,7 +3875,7 @@
       <w:pPr>
         <w:pStyle w:val="note"/>
         <w:bidi/>
-        <w:divId w:val="685323372"/>
+        <w:divId w:val="972368265"/>
         <w:rPr>
           <w:rFonts w:ascii="Segoe UI" w:hAnsi="Segoe UI" w:cs="Segoe UI"/>
           <w:rtl/>
@@ -4008,7 +4008,7 @@
       <w:pPr>
         <w:pStyle w:val="3"/>
         <w:bidi/>
-        <w:divId w:val="685323372"/>
+        <w:divId w:val="972368265"/>
         <w:rPr>
           <w:rFonts w:ascii="Segoe UI" w:eastAsia="Times New Roman" w:hAnsi="Segoe UI" w:cs="Segoe UI"/>
           <w:rtl/>
@@ -4092,7 +4092,7 @@
       <w:pPr>
         <w:pStyle w:val="a7"/>
         <w:bidi/>
-        <w:divId w:val="685323372"/>
+        <w:divId w:val="972368265"/>
         <w:rPr>
           <w:rFonts w:ascii="Segoe UI" w:hAnsi="Segoe UI" w:cs="Segoe UI"/>
           <w:color w:val="1C1C1C"/>
@@ -5059,7 +5059,7 @@
       <w:pPr>
         <w:pStyle w:val="3"/>
         <w:bidi/>
-        <w:divId w:val="685323372"/>
+        <w:divId w:val="972368265"/>
         <w:rPr>
           <w:rFonts w:ascii="Segoe UI" w:eastAsia="Times New Roman" w:hAnsi="Segoe UI" w:cs="Segoe UI"/>
           <w:rtl/>
@@ -5127,7 +5127,7 @@
       <w:pPr>
         <w:pStyle w:val="a7"/>
         <w:bidi/>
-        <w:divId w:val="685323372"/>
+        <w:divId w:val="972368265"/>
         <w:rPr>
           <w:rFonts w:ascii="Segoe UI" w:hAnsi="Segoe UI" w:cs="Segoe UI"/>
           <w:color w:val="1C1C1C"/>
@@ -5878,7 +5878,7 @@
       <w:pPr>
         <w:pStyle w:val="3"/>
         <w:bidi/>
-        <w:divId w:val="685323372"/>
+        <w:divId w:val="972368265"/>
         <w:rPr>
           <w:rFonts w:ascii="Segoe UI" w:eastAsia="Times New Roman" w:hAnsi="Segoe UI" w:cs="Segoe UI"/>
           <w:rtl/>
@@ -5930,7 +5930,7 @@
       <w:pPr>
         <w:pStyle w:val="a7"/>
         <w:bidi/>
-        <w:divId w:val="685323372"/>
+        <w:divId w:val="972368265"/>
         <w:rPr>
           <w:rFonts w:ascii="Segoe UI" w:hAnsi="Segoe UI" w:cs="Segoe UI"/>
           <w:color w:val="1C1C1C"/>
@@ -6852,7 +6852,7 @@
       <w:pPr>
         <w:pStyle w:val="3"/>
         <w:bidi/>
-        <w:divId w:val="685323372"/>
+        <w:divId w:val="972368265"/>
         <w:rPr>
           <w:rFonts w:ascii="Segoe UI" w:eastAsia="Times New Roman" w:hAnsi="Segoe UI" w:cs="Segoe UI"/>
           <w:rtl/>
@@ -6968,7 +6968,7 @@
       <w:pPr>
         <w:pStyle w:val="a7"/>
         <w:bidi/>
-        <w:divId w:val="685323372"/>
+        <w:divId w:val="972368265"/>
         <w:rPr>
           <w:rFonts w:ascii="Segoe UI" w:hAnsi="Segoe UI" w:cs="Segoe UI"/>
           <w:color w:val="1C1C1C"/>
@@ -7179,7 +7179,7 @@
       <w:pPr>
         <w:pStyle w:val="a7"/>
         <w:bidi/>
-        <w:divId w:val="685323372"/>
+        <w:divId w:val="972368265"/>
         <w:rPr>
           <w:rFonts w:ascii="Segoe UI" w:hAnsi="Segoe UI" w:cs="Segoe UI"/>
           <w:color w:val="1C1C1C"/>
@@ -7453,7 +7453,7 @@
       <w:pPr>
         <w:pStyle w:val="a7"/>
         <w:bidi/>
-        <w:divId w:val="685323372"/>
+        <w:divId w:val="972368265"/>
         <w:rPr>
           <w:rFonts w:ascii="Segoe UI" w:hAnsi="Segoe UI" w:cs="Segoe UI"/>
           <w:color w:val="1C1C1C"/>
@@ -7592,7 +7592,7 @@
       <w:pPr>
         <w:pStyle w:val="3"/>
         <w:bidi/>
-        <w:divId w:val="685323372"/>
+        <w:divId w:val="972368265"/>
         <w:rPr>
           <w:rFonts w:ascii="Segoe UI" w:eastAsia="Times New Roman" w:hAnsi="Segoe UI" w:cs="Segoe UI"/>
           <w:rtl/>
@@ -7628,7 +7628,7 @@
       <w:pPr>
         <w:pStyle w:val="a7"/>
         <w:bidi/>
-        <w:divId w:val="685323372"/>
+        <w:divId w:val="972368265"/>
         <w:rPr>
           <w:rFonts w:ascii="Segoe UI" w:hAnsi="Segoe UI" w:cs="Segoe UI"/>
           <w:color w:val="1C1C1C"/>
@@ -7965,7 +7965,7 @@
       <w:pPr>
         <w:pStyle w:val="a7"/>
         <w:bidi/>
-        <w:divId w:val="685323372"/>
+        <w:divId w:val="972368265"/>
         <w:rPr>
           <w:rFonts w:ascii="Segoe UI" w:hAnsi="Segoe UI" w:cs="Segoe UI"/>
           <w:color w:val="1C1C1C"/>
@@ -8086,7 +8086,7 @@
       <w:pPr>
         <w:pStyle w:val="note"/>
         <w:bidi/>
-        <w:divId w:val="685323372"/>
+        <w:divId w:val="972368265"/>
         <w:rPr>
           <w:rFonts w:ascii="Segoe UI" w:hAnsi="Segoe UI" w:cs="Segoe UI"/>
           <w:rtl/>
@@ -8164,7 +8164,7 @@
       <w:pPr>
         <w:pStyle w:val="a7"/>
         <w:bidi/>
-        <w:divId w:val="685323372"/>
+        <w:divId w:val="972368265"/>
         <w:rPr>
           <w:rFonts w:ascii="Segoe UI" w:hAnsi="Segoe UI" w:cs="Segoe UI"/>
           <w:color w:val="1C1C1C"/>
@@ -8465,7 +8465,7 @@
       <w:pPr>
         <w:pStyle w:val="a7"/>
         <w:bidi/>
-        <w:divId w:val="685323372"/>
+        <w:divId w:val="972368265"/>
         <w:rPr>
           <w:rFonts w:ascii="Segoe UI" w:hAnsi="Segoe UI" w:cs="Segoe UI"/>
           <w:color w:val="1C1C1C"/>
@@ -8487,7 +8487,7 @@
       <w:pPr>
         <w:pStyle w:val="note"/>
         <w:bidi/>
-        <w:divId w:val="685323372"/>
+        <w:divId w:val="972368265"/>
         <w:rPr>
           <w:rFonts w:ascii="Segoe UI" w:hAnsi="Segoe UI" w:cs="Segoe UI"/>
           <w:rtl/>
@@ -8510,7 +8510,7 @@
       <w:pPr>
         <w:pStyle w:val="note"/>
         <w:bidi/>
-        <w:divId w:val="685323372"/>
+        <w:divId w:val="972368265"/>
         <w:rPr>
           <w:rFonts w:ascii="Segoe UI" w:hAnsi="Segoe UI" w:cs="Segoe UI"/>
           <w:rtl/>
@@ -8610,7 +8610,7 @@
       <w:pPr>
         <w:pStyle w:val="a7"/>
         <w:bidi/>
-        <w:divId w:val="685323372"/>
+        <w:divId w:val="972368265"/>
         <w:rPr>
           <w:rFonts w:ascii="Segoe UI" w:hAnsi="Segoe UI" w:cs="Segoe UI"/>
           <w:color w:val="1C1C1C"/>
@@ -9064,7 +9064,7 @@
       <w:pPr>
         <w:pStyle w:val="a7"/>
         <w:bidi/>
-        <w:divId w:val="685323372"/>
+        <w:divId w:val="972368265"/>
         <w:rPr>
           <w:rFonts w:ascii="Segoe UI" w:hAnsi="Segoe UI" w:cs="Segoe UI"/>
           <w:color w:val="1C1C1C"/>
@@ -9322,7 +9322,7 @@
           <w:rtl/>
           <w:lang/>
         </w:rPr>
-        <w:t xml:space="preserve"> 220 </w:t>
+        <w:t xml:space="preserve"> 225 </w:t>
       </w:r>
       <w:r>
         <w:rPr>
@@ -9412,7 +9412,7 @@
           <w:rtl/>
           <w:lang/>
         </w:rPr>
-        <w:t xml:space="preserve"> 680 </w:t>
+        <w:t xml:space="preserve"> 760 </w:t>
       </w:r>
       <w:r>
         <w:rPr>
@@ -9466,7 +9466,205 @@
           <w:rtl/>
           <w:lang/>
         </w:rPr>
-        <w:t xml:space="preserve"> NFC. 11 </w:t>
+        <w:t xml:space="preserve"> NFC</w:t>
+      </w:r>
+      <w:r>
+        <w:rPr>
+          <w:rFonts w:ascii="Tahoma" w:hAnsi="Tahoma" w:cs="Tahoma" w:hint="cs"/>
+          <w:color w:val="1C1C1C"/>
+          <w:rtl/>
+          <w:lang/>
+        </w:rPr>
+        <w:t>،</w:t>
+      </w:r>
+      <w:r>
+        <w:rPr>
+          <w:rFonts w:ascii="Segoe UI" w:hAnsi="Segoe UI" w:cs="Segoe UI" w:hint="cs"/>
+          <w:color w:val="1C1C1C"/>
+          <w:rtl/>
+          <w:lang/>
+        </w:rPr>
+        <w:t xml:space="preserve"> </w:t>
+      </w:r>
+      <w:r>
+        <w:rPr>
+          <w:rFonts w:ascii="Tahoma" w:hAnsi="Tahoma" w:cs="Tahoma" w:hint="cs"/>
+          <w:color w:val="1C1C1C"/>
+          <w:rtl/>
+          <w:lang/>
+        </w:rPr>
+        <w:t>ووزن</w:t>
+      </w:r>
+      <w:r>
+        <w:rPr>
+          <w:rFonts w:ascii="Segoe UI" w:hAnsi="Segoe UI" w:cs="Segoe UI" w:hint="cs"/>
+          <w:color w:val="1C1C1C"/>
+          <w:rtl/>
+          <w:lang/>
+        </w:rPr>
+        <w:t xml:space="preserve"> </w:t>
+      </w:r>
+      <w:r>
+        <w:rPr>
+          <w:rFonts w:ascii="Tahoma" w:hAnsi="Tahoma" w:cs="Tahoma" w:hint="cs"/>
+          <w:color w:val="1C1C1C"/>
+          <w:rtl/>
+          <w:lang/>
+        </w:rPr>
+        <w:t>المجموعة</w:t>
+      </w:r>
+      <w:r>
+        <w:rPr>
+          <w:rFonts w:ascii="Segoe UI" w:hAnsi="Segoe UI" w:cs="Segoe UI" w:hint="cs"/>
+          <w:color w:val="1C1C1C"/>
+          <w:rtl/>
+          <w:lang/>
+        </w:rPr>
+        <w:t xml:space="preserve"> </w:t>
+      </w:r>
+      <w:r>
+        <w:rPr>
+          <w:rFonts w:ascii="Tahoma" w:hAnsi="Tahoma" w:cs="Tahoma" w:hint="cs"/>
+          <w:color w:val="1C1C1C"/>
+          <w:rtl/>
+          <w:lang/>
+        </w:rPr>
+        <w:t>كاملة</w:t>
+      </w:r>
+      <w:r>
+        <w:rPr>
+          <w:rFonts w:ascii="Segoe UI" w:hAnsi="Segoe UI" w:cs="Segoe UI" w:hint="cs"/>
+          <w:color w:val="1C1C1C"/>
+          <w:rtl/>
+          <w:lang/>
+        </w:rPr>
+        <w:t xml:space="preserve"> 150 </w:t>
+      </w:r>
+      <w:r>
+        <w:rPr>
+          <w:rFonts w:ascii="Tahoma" w:hAnsi="Tahoma" w:cs="Tahoma" w:hint="cs"/>
+          <w:color w:val="1C1C1C"/>
+          <w:rtl/>
+          <w:lang/>
+        </w:rPr>
+        <w:t>غ</w:t>
+      </w:r>
+      <w:r>
+        <w:rPr>
+          <w:rFonts w:ascii="Segoe UI" w:hAnsi="Segoe UI" w:cs="Segoe UI" w:hint="cs"/>
+          <w:color w:val="1C1C1C"/>
+          <w:rtl/>
+          <w:lang/>
+        </w:rPr>
+        <w:t xml:space="preserve">. </w:t>
+      </w:r>
+      <w:r>
+        <w:rPr>
+          <w:rFonts w:ascii="Tahoma" w:hAnsi="Tahoma" w:cs="Tahoma" w:hint="cs"/>
+          <w:color w:val="1C1C1C"/>
+          <w:rtl/>
+          <w:lang/>
+        </w:rPr>
+        <w:t>وزن</w:t>
+      </w:r>
+      <w:r>
+        <w:rPr>
+          <w:rFonts w:ascii="Segoe UI" w:hAnsi="Segoe UI" w:cs="Segoe UI"/>
+          <w:color w:val="1C1C1C"/>
+          <w:rtl/>
+          <w:lang/>
+        </w:rPr>
+        <w:t xml:space="preserve"> </w:t>
+      </w:r>
+      <w:r>
+        <w:rPr>
+          <w:rFonts w:ascii="Tahoma" w:hAnsi="Tahoma" w:cs="Tahoma" w:hint="cs"/>
+          <w:color w:val="1C1C1C"/>
+          <w:rtl/>
+          <w:lang/>
+        </w:rPr>
+        <w:t>الطقم</w:t>
+      </w:r>
+      <w:r>
+        <w:rPr>
+          <w:rFonts w:ascii="Segoe UI" w:hAnsi="Segoe UI" w:cs="Segoe UI" w:hint="cs"/>
+          <w:color w:val="1C1C1C"/>
+          <w:rtl/>
+          <w:lang/>
+        </w:rPr>
+        <w:t xml:space="preserve"> </w:t>
+      </w:r>
+      <w:r>
+        <w:rPr>
+          <w:rFonts w:ascii="Tahoma" w:hAnsi="Tahoma" w:cs="Tahoma" w:hint="cs"/>
+          <w:color w:val="1C1C1C"/>
+          <w:rtl/>
+          <w:lang/>
+        </w:rPr>
+        <w:t>في</w:t>
+      </w:r>
+      <w:r>
+        <w:rPr>
+          <w:rFonts w:ascii="Segoe UI" w:hAnsi="Segoe UI" w:cs="Segoe UI" w:hint="cs"/>
+          <w:color w:val="1C1C1C"/>
+          <w:rtl/>
+          <w:lang/>
+        </w:rPr>
+        <w:t xml:space="preserve"> </w:t>
+      </w:r>
+      <w:r>
+        <w:rPr>
+          <w:rFonts w:ascii="Tahoma" w:hAnsi="Tahoma" w:cs="Tahoma" w:hint="cs"/>
+          <w:color w:val="1C1C1C"/>
+          <w:rtl/>
+          <w:lang/>
+        </w:rPr>
+        <w:t>العلبة</w:t>
+      </w:r>
+      <w:r>
+        <w:rPr>
+          <w:rFonts w:ascii="Segoe UI" w:hAnsi="Segoe UI" w:cs="Segoe UI" w:hint="cs"/>
+          <w:color w:val="1C1C1C"/>
+          <w:rtl/>
+          <w:lang/>
+        </w:rPr>
+        <w:t xml:space="preserve"> </w:t>
+      </w:r>
+      <w:r>
+        <w:rPr>
+          <w:rFonts w:ascii="Tahoma" w:hAnsi="Tahoma" w:cs="Tahoma" w:hint="cs"/>
+          <w:color w:val="1C1C1C"/>
+          <w:rtl/>
+          <w:lang/>
+        </w:rPr>
+        <w:t>نحو</w:t>
+      </w:r>
+      <w:r>
+        <w:rPr>
+          <w:rFonts w:ascii="Segoe UI" w:hAnsi="Segoe UI" w:cs="Segoe UI" w:hint="cs"/>
+          <w:color w:val="1C1C1C"/>
+          <w:rtl/>
+          <w:lang/>
+        </w:rPr>
+        <w:t xml:space="preserve"> 1,9 </w:t>
+      </w:r>
+      <w:r>
+        <w:rPr>
+          <w:rFonts w:ascii="Tahoma" w:hAnsi="Tahoma" w:cs="Tahoma" w:hint="cs"/>
+          <w:color w:val="1C1C1C"/>
+          <w:rtl/>
+          <w:lang/>
+        </w:rPr>
+        <w:t>كغ</w:t>
+      </w:r>
+      <w:r>
+        <w:rPr>
+          <w:rFonts w:ascii="Segoe UI" w:hAnsi="Segoe UI" w:cs="Segoe UI" w:hint="cs"/>
+          <w:color w:val="1C1C1C"/>
+          <w:rtl/>
+          <w:lang/>
+        </w:rPr>
+        <w:t xml:space="preserve">. 11 </w:t>
       </w:r>
       <w:r>
         <w:rPr>
@@ -9529,16 +9727,7 @@
           <w:rtl/>
           <w:lang/>
         </w:rPr>
-        <w:t>الافترا</w:t>
-      </w:r>
-      <w:r>
-        <w:rPr>
-          <w:rFonts w:ascii="Tahoma" w:hAnsi="Tahoma" w:cs="Tahoma" w:hint="cs"/>
-          <w:color w:val="1C1C1C"/>
-          <w:rtl/>
-          <w:lang/>
-        </w:rPr>
-        <w:t>ضية</w:t>
+        <w:t>الافتراضية</w:t>
       </w:r>
       <w:r>
         <w:rPr>
@@ -9968,7 +10157,7 @@
       <w:pPr>
         <w:pStyle w:val="a7"/>
         <w:bidi/>
-        <w:divId w:val="685323372"/>
+        <w:divId w:val="972368265"/>
         <w:rPr>
           <w:rFonts w:ascii="Segoe UI" w:hAnsi="Segoe UI" w:cs="Segoe UI"/>
           <w:color w:val="1C1C1C"/>
@@ -10181,16 +10370,7 @@
           <w:rtl/>
           <w:lang/>
         </w:rPr>
-        <w:t>ال</w:t>
-      </w:r>
-      <w:r>
-        <w:rPr>
-          <w:rFonts w:ascii="Tahoma" w:hAnsi="Tahoma" w:cs="Tahoma" w:hint="cs"/>
-          <w:color w:val="1C1C1C"/>
-          <w:rtl/>
-          <w:lang/>
-        </w:rPr>
-        <w:t>موزّع</w:t>
+        <w:t>الموزّع</w:t>
       </w:r>
       <w:r>
         <w:rPr>
@@ -10206,7 +10386,7 @@
       <w:pPr>
         <w:pStyle w:val="note"/>
         <w:bidi/>
-        <w:divId w:val="685323372"/>
+        <w:divId w:val="972368265"/>
         <w:rPr>
           <w:rFonts w:ascii="Segoe UI" w:hAnsi="Segoe UI" w:cs="Segoe UI"/>
           <w:rtl/>
@@ -10328,7 +10508,7 @@
       <w:pPr>
         <w:pStyle w:val="note"/>
         <w:bidi/>
-        <w:divId w:val="685323372"/>
+        <w:divId w:val="972368265"/>
         <w:rPr>
           <w:rFonts w:ascii="Segoe UI" w:hAnsi="Segoe UI" w:cs="Segoe UI"/>
           <w:rtl/>

</xml_diff>